<commit_message>
fixing errors in oligos
</commit_message>
<xml_diff>
--- a/Manuscript/alleles/20260901_ZFIN_submission_mtnr_alleles.docx
+++ b/Manuscript/alleles/20260901_ZFIN_submission_mtnr_alleles.docx
@@ -18,7 +18,31 @@
           <w:szCs w:val="30"/>
           <w:lang w:val="en-US"/>
         </w:rPr>
-        <w:t>ZFIN — Submit a Proposed Mutant/Tg Line Name</w:t>
+        <w:t>ZFIN — Submit a Proposed Mutant/</w:t>
+      </w:r>
+      <w:proofErr w:type="spellStart"/>
+      <w:r>
+        <w:rPr>
+          <w:rFonts w:ascii="Calibri" w:eastAsia="Calibri" w:hAnsi="Calibri" w:cs="Calibri"/>
+          <w:b/>
+          <w:bCs/>
+          <w:sz w:val="30"/>
+          <w:szCs w:val="30"/>
+          <w:lang w:val="en-US"/>
+        </w:rPr>
+        <w:t>Tg</w:t>
+      </w:r>
+      <w:proofErr w:type="spellEnd"/>
+      <w:r>
+        <w:rPr>
+          <w:rFonts w:ascii="Calibri" w:eastAsia="Calibri" w:hAnsi="Calibri" w:cs="Calibri"/>
+          <w:b/>
+          <w:bCs/>
+          <w:sz w:val="30"/>
+          <w:szCs w:val="30"/>
+          <w:lang w:val="en-US"/>
+        </w:rPr>
+        <w:t xml:space="preserve"> Line Name</w:t>
       </w:r>
     </w:p>
     <w:p>
@@ -64,7 +88,27 @@
           <w:szCs w:val="18"/>
           <w:lang w:val="en-US"/>
         </w:rPr>
-        <w:t>please verify every sequence and number against the primary records — ARTICLE primers.xlsx and the allele PowerPoint, both in allele_source_data/.</w:t>
+        <w:t xml:space="preserve">please verify every sequence and number against the primary records — ARTICLE primers.xlsx and the allele PowerPoint, both in </w:t>
+      </w:r>
+      <w:proofErr w:type="spellStart"/>
+      <w:r>
+        <w:rPr>
+          <w:rFonts w:ascii="Calibri" w:eastAsia="Calibri" w:hAnsi="Calibri" w:cs="Calibri"/>
+          <w:sz w:val="18"/>
+          <w:szCs w:val="18"/>
+          <w:lang w:val="en-US"/>
+        </w:rPr>
+        <w:t>allele_source_data</w:t>
+      </w:r>
+      <w:proofErr w:type="spellEnd"/>
+      <w:r>
+        <w:rPr>
+          <w:rFonts w:ascii="Calibri" w:eastAsia="Calibri" w:hAnsi="Calibri" w:cs="Calibri"/>
+          <w:sz w:val="18"/>
+          <w:szCs w:val="18"/>
+          <w:lang w:val="en-US"/>
+        </w:rPr>
+        <w:t>/.</w:t>
       </w:r>
     </w:p>
     <w:p>
@@ -148,7 +192,25 @@
                 <w:sz w:val="19"/>
                 <w:szCs w:val="19"/>
               </w:rPr>
-              <w:t>Owen Randlett  (ZDB-PERS-110323-1)</w:t>
+              <w:t xml:space="preserve">Owen </w:t>
+            </w:r>
+            <w:proofErr w:type="gramStart"/>
+            <w:r>
+              <w:rPr>
+                <w:rFonts w:ascii="Calibri" w:eastAsia="Calibri" w:hAnsi="Calibri" w:cs="Calibri"/>
+                <w:sz w:val="19"/>
+                <w:szCs w:val="19"/>
+              </w:rPr>
+              <w:t>Randlett  (</w:t>
+            </w:r>
+            <w:proofErr w:type="gramEnd"/>
+            <w:r>
+              <w:rPr>
+                <w:rFonts w:ascii="Calibri" w:eastAsia="Calibri" w:hAnsi="Calibri" w:cs="Calibri"/>
+                <w:sz w:val="19"/>
+                <w:szCs w:val="19"/>
+              </w:rPr>
+              <w:t>ZDB-PERS-110323-1)</w:t>
             </w:r>
           </w:p>
         </w:tc>
@@ -219,6 +281,7 @@
             </w:tcMar>
           </w:tcPr>
           <w:p>
+            <w:proofErr w:type="spellStart"/>
             <w:r>
               <w:rPr>
                 <w:rFonts w:ascii="Calibri" w:eastAsia="Calibri" w:hAnsi="Calibri" w:cs="Calibri"/>
@@ -229,6 +292,7 @@
               </w:rPr>
               <w:t>Laboratory</w:t>
             </w:r>
+            <w:proofErr w:type="spellEnd"/>
           </w:p>
         </w:tc>
         <w:tc>
@@ -248,7 +312,61 @@
                 <w:sz w:val="19"/>
                 <w:szCs w:val="19"/>
               </w:rPr>
-              <w:t>Randlett Lab (ZDB-LAB-240321-1) — Laboratoire MeLiS, CNRS UMR 5284 / INSERM U1314, Université Claude Bernard Lyon 1, Institut NeuroMyoGène, 8 avenue Rockefeller, 69008 Lyon, France</w:t>
+              <w:t xml:space="preserve">Randlett </w:t>
+            </w:r>
+            <w:proofErr w:type="spellStart"/>
+            <w:r>
+              <w:rPr>
+                <w:rFonts w:ascii="Calibri" w:eastAsia="Calibri" w:hAnsi="Calibri" w:cs="Calibri"/>
+                <w:sz w:val="19"/>
+                <w:szCs w:val="19"/>
+              </w:rPr>
+              <w:t>Lab</w:t>
+            </w:r>
+            <w:proofErr w:type="spellEnd"/>
+            <w:r>
+              <w:rPr>
+                <w:rFonts w:ascii="Calibri" w:eastAsia="Calibri" w:hAnsi="Calibri" w:cs="Calibri"/>
+                <w:sz w:val="19"/>
+                <w:szCs w:val="19"/>
+              </w:rPr>
+              <w:t xml:space="preserve"> (ZDB-LAB-240321-1) — Laboratoire </w:t>
+            </w:r>
+            <w:proofErr w:type="spellStart"/>
+            <w:r>
+              <w:rPr>
+                <w:rFonts w:ascii="Calibri" w:eastAsia="Calibri" w:hAnsi="Calibri" w:cs="Calibri"/>
+                <w:sz w:val="19"/>
+                <w:szCs w:val="19"/>
+              </w:rPr>
+              <w:t>MeLiS</w:t>
+            </w:r>
+            <w:proofErr w:type="spellEnd"/>
+            <w:r>
+              <w:rPr>
+                <w:rFonts w:ascii="Calibri" w:eastAsia="Calibri" w:hAnsi="Calibri" w:cs="Calibri"/>
+                <w:sz w:val="19"/>
+                <w:szCs w:val="19"/>
+              </w:rPr>
+              <w:t xml:space="preserve">, CNRS UMR 5284 / INSERM U1314, Université Claude Bernard Lyon 1, Institut </w:t>
+            </w:r>
+            <w:proofErr w:type="spellStart"/>
+            <w:r>
+              <w:rPr>
+                <w:rFonts w:ascii="Calibri" w:eastAsia="Calibri" w:hAnsi="Calibri" w:cs="Calibri"/>
+                <w:sz w:val="19"/>
+                <w:szCs w:val="19"/>
+              </w:rPr>
+              <w:t>NeuroMyoGène</w:t>
+            </w:r>
+            <w:proofErr w:type="spellEnd"/>
+            <w:r>
+              <w:rPr>
+                <w:rFonts w:ascii="Calibri" w:eastAsia="Calibri" w:hAnsi="Calibri" w:cs="Calibri"/>
+                <w:sz w:val="19"/>
+                <w:szCs w:val="19"/>
+              </w:rPr>
+              <w:t>, 8 avenue Rockefeller, 69008 Lyon, France</w:t>
             </w:r>
           </w:p>
         </w:tc>
@@ -294,7 +412,31 @@
           <w:szCs w:val="18"/>
           <w:lang w:val="en-US"/>
         </w:rPr>
-        <w:t>Six lines. The designation "ly" was approved for this laboratory by the ZFIN Nomenclature Coordinator.</w:t>
+        <w:t>Six lines. The designation "</w:t>
+      </w:r>
+      <w:proofErr w:type="spellStart"/>
+      <w:r>
+        <w:rPr>
+          <w:rFonts w:ascii="Calibri" w:eastAsia="Calibri" w:hAnsi="Calibri" w:cs="Calibri"/>
+          <w:i/>
+          <w:iCs/>
+          <w:sz w:val="18"/>
+          <w:szCs w:val="18"/>
+          <w:lang w:val="en-US"/>
+        </w:rPr>
+        <w:t>ly</w:t>
+      </w:r>
+      <w:proofErr w:type="spellEnd"/>
+      <w:r>
+        <w:rPr>
+          <w:rFonts w:ascii="Calibri" w:eastAsia="Calibri" w:hAnsi="Calibri" w:cs="Calibri"/>
+          <w:i/>
+          <w:iCs/>
+          <w:sz w:val="18"/>
+          <w:szCs w:val="18"/>
+          <w:lang w:val="en-US"/>
+        </w:rPr>
+        <w:t>" was approved for this laboratory by the ZFIN Nomenclature Coordinator.</w:t>
       </w:r>
     </w:p>
     <w:p>
@@ -376,15 +518,27 @@
             <w:pPr>
               <w:keepNext/>
             </w:pPr>
-            <w:r>
-              <w:rPr>
-                <w:rFonts w:ascii="Calibri" w:eastAsia="Calibri" w:hAnsi="Calibri" w:cs="Calibri"/>
-                <w:b/>
-                <w:bCs/>
-                <w:sz w:val="18"/>
-                <w:szCs w:val="18"/>
-              </w:rPr>
-              <w:t>Genetic Background</w:t>
+            <w:proofErr w:type="spellStart"/>
+            <w:r>
+              <w:rPr>
+                <w:rFonts w:ascii="Calibri" w:eastAsia="Calibri" w:hAnsi="Calibri" w:cs="Calibri"/>
+                <w:b/>
+                <w:bCs/>
+                <w:sz w:val="18"/>
+                <w:szCs w:val="18"/>
+              </w:rPr>
+              <w:t>Genetic</w:t>
+            </w:r>
+            <w:proofErr w:type="spellEnd"/>
+            <w:r>
+              <w:rPr>
+                <w:rFonts w:ascii="Calibri" w:eastAsia="Calibri" w:hAnsi="Calibri" w:cs="Calibri"/>
+                <w:b/>
+                <w:bCs/>
+                <w:sz w:val="18"/>
+                <w:szCs w:val="18"/>
+              </w:rPr>
+              <w:t xml:space="preserve"> Background</w:t>
             </w:r>
           </w:p>
         </w:tc>
@@ -440,7 +594,29 @@
                 <w:sz w:val="18"/>
                 <w:szCs w:val="18"/>
               </w:rPr>
-              <w:t>Gene or Construct Name</w:t>
+              <w:t xml:space="preserve">Gene or </w:t>
+            </w:r>
+            <w:proofErr w:type="spellStart"/>
+            <w:r>
+              <w:rPr>
+                <w:rFonts w:ascii="Calibri" w:eastAsia="Calibri" w:hAnsi="Calibri" w:cs="Calibri"/>
+                <w:b/>
+                <w:bCs/>
+                <w:sz w:val="18"/>
+                <w:szCs w:val="18"/>
+              </w:rPr>
+              <w:t>Construct</w:t>
+            </w:r>
+            <w:proofErr w:type="spellEnd"/>
+            <w:r>
+              <w:rPr>
+                <w:rFonts w:ascii="Calibri" w:eastAsia="Calibri" w:hAnsi="Calibri" w:cs="Calibri"/>
+                <w:b/>
+                <w:bCs/>
+                <w:sz w:val="18"/>
+                <w:szCs w:val="18"/>
+              </w:rPr>
+              <w:t xml:space="preserve"> Name</w:t>
             </w:r>
           </w:p>
         </w:tc>
@@ -458,13 +634,43 @@
             <w:pPr>
               <w:keepNext/>
             </w:pPr>
-            <w:r>
-              <w:rPr>
-                <w:rFonts w:ascii="Calibri" w:eastAsia="Calibri" w:hAnsi="Calibri" w:cs="Calibri"/>
-                <w:sz w:val="19"/>
-                <w:szCs w:val="19"/>
-              </w:rPr>
-              <w:t>melatonin receptor 1A a</w:t>
+            <w:proofErr w:type="spellStart"/>
+            <w:proofErr w:type="gramStart"/>
+            <w:r>
+              <w:rPr>
+                <w:rFonts w:ascii="Calibri" w:eastAsia="Calibri" w:hAnsi="Calibri" w:cs="Calibri"/>
+                <w:sz w:val="19"/>
+                <w:szCs w:val="19"/>
+              </w:rPr>
+              <w:t>melatonin</w:t>
+            </w:r>
+            <w:proofErr w:type="spellEnd"/>
+            <w:proofErr w:type="gramEnd"/>
+            <w:r>
+              <w:rPr>
+                <w:rFonts w:ascii="Calibri" w:eastAsia="Calibri" w:hAnsi="Calibri" w:cs="Calibri"/>
+                <w:sz w:val="19"/>
+                <w:szCs w:val="19"/>
+              </w:rPr>
+              <w:t xml:space="preserve"> </w:t>
+            </w:r>
+            <w:proofErr w:type="spellStart"/>
+            <w:r>
+              <w:rPr>
+                <w:rFonts w:ascii="Calibri" w:eastAsia="Calibri" w:hAnsi="Calibri" w:cs="Calibri"/>
+                <w:sz w:val="19"/>
+                <w:szCs w:val="19"/>
+              </w:rPr>
+              <w:t>receptor</w:t>
+            </w:r>
+            <w:proofErr w:type="spellEnd"/>
+            <w:r>
+              <w:rPr>
+                <w:rFonts w:ascii="Calibri" w:eastAsia="Calibri" w:hAnsi="Calibri" w:cs="Calibri"/>
+                <w:sz w:val="19"/>
+                <w:szCs w:val="19"/>
+              </w:rPr>
+              <w:t xml:space="preserve"> 1A a</w:t>
             </w:r>
           </w:p>
         </w:tc>
@@ -514,6 +720,7 @@
             <w:pPr>
               <w:keepNext/>
             </w:pPr>
+            <w:proofErr w:type="gramStart"/>
             <w:r>
               <w:rPr>
                 <w:rFonts w:ascii="Calibri" w:eastAsia="Calibri" w:hAnsi="Calibri" w:cs="Calibri"/>
@@ -522,7 +729,18 @@
                 <w:sz w:val="19"/>
                 <w:szCs w:val="19"/>
               </w:rPr>
-              <w:t>mtnr1aa</w:t>
+              <w:t>mtnr</w:t>
+            </w:r>
+            <w:proofErr w:type="gramEnd"/>
+            <w:r>
+              <w:rPr>
+                <w:rFonts w:ascii="Calibri" w:eastAsia="Calibri" w:hAnsi="Calibri" w:cs="Calibri"/>
+                <w:i/>
+                <w:iCs/>
+                <w:sz w:val="19"/>
+                <w:szCs w:val="19"/>
+              </w:rPr>
+              <w:t>1aa</w:t>
             </w:r>
             <w:r>
               <w:rPr>
@@ -554,16 +772,40 @@
             <w:pPr>
               <w:keepNext/>
             </w:pPr>
-            <w:r>
-              <w:rPr>
-                <w:rFonts w:ascii="Calibri" w:eastAsia="Calibri" w:hAnsi="Calibri" w:cs="Calibri"/>
-                <w:b/>
-                <w:bCs/>
-                <w:sz w:val="18"/>
-                <w:szCs w:val="18"/>
-              </w:rPr>
-              <w:t>Allele/Line Designation</w:t>
-            </w:r>
+            <w:proofErr w:type="spellStart"/>
+            <w:r>
+              <w:rPr>
+                <w:rFonts w:ascii="Calibri" w:eastAsia="Calibri" w:hAnsi="Calibri" w:cs="Calibri"/>
+                <w:b/>
+                <w:bCs/>
+                <w:sz w:val="18"/>
+                <w:szCs w:val="18"/>
+              </w:rPr>
+              <w:t>Allele</w:t>
+            </w:r>
+            <w:proofErr w:type="spellEnd"/>
+            <w:r>
+              <w:rPr>
+                <w:rFonts w:ascii="Calibri" w:eastAsia="Calibri" w:hAnsi="Calibri" w:cs="Calibri"/>
+                <w:b/>
+                <w:bCs/>
+                <w:sz w:val="18"/>
+                <w:szCs w:val="18"/>
+              </w:rPr>
+              <w:t xml:space="preserve">/Line </w:t>
+            </w:r>
+            <w:proofErr w:type="spellStart"/>
+            <w:r>
+              <w:rPr>
+                <w:rFonts w:ascii="Calibri" w:eastAsia="Calibri" w:hAnsi="Calibri" w:cs="Calibri"/>
+                <w:b/>
+                <w:bCs/>
+                <w:sz w:val="18"/>
+                <w:szCs w:val="18"/>
+              </w:rPr>
+              <w:t>Designation</w:t>
+            </w:r>
+            <w:proofErr w:type="spellEnd"/>
           </w:p>
         </w:tc>
         <w:tc>
@@ -580,13 +822,23 @@
             <w:pPr>
               <w:keepNext/>
             </w:pPr>
-            <w:r>
-              <w:rPr>
-                <w:rFonts w:ascii="Calibri" w:eastAsia="Calibri" w:hAnsi="Calibri" w:cs="Calibri"/>
-                <w:sz w:val="19"/>
-                <w:szCs w:val="19"/>
-              </w:rPr>
-              <w:t>ly1</w:t>
+            <w:proofErr w:type="gramStart"/>
+            <w:r>
+              <w:rPr>
+                <w:rFonts w:ascii="Calibri" w:eastAsia="Calibri" w:hAnsi="Calibri" w:cs="Calibri"/>
+                <w:sz w:val="19"/>
+                <w:szCs w:val="19"/>
+              </w:rPr>
+              <w:t>ly</w:t>
+            </w:r>
+            <w:proofErr w:type="gramEnd"/>
+            <w:r>
+              <w:rPr>
+                <w:rFonts w:ascii="Calibri" w:eastAsia="Calibri" w:hAnsi="Calibri" w:cs="Calibri"/>
+                <w:sz w:val="19"/>
+                <w:szCs w:val="19"/>
+              </w:rPr>
+              <w:t>1</w:t>
             </w:r>
           </w:p>
         </w:tc>
@@ -642,7 +894,25 @@
                 <w:sz w:val="19"/>
                 <w:szCs w:val="19"/>
               </w:rPr>
-              <w:t>Cas9 protein injection</w:t>
+              <w:t xml:space="preserve">Cas9 </w:t>
+            </w:r>
+            <w:proofErr w:type="spellStart"/>
+            <w:r>
+              <w:rPr>
+                <w:rFonts w:ascii="Calibri" w:eastAsia="Calibri" w:hAnsi="Calibri" w:cs="Calibri"/>
+                <w:sz w:val="19"/>
+                <w:szCs w:val="19"/>
+              </w:rPr>
+              <w:t>protein</w:t>
+            </w:r>
+            <w:proofErr w:type="spellEnd"/>
+            <w:r>
+              <w:rPr>
+                <w:rFonts w:ascii="Calibri" w:eastAsia="Calibri" w:hAnsi="Calibri" w:cs="Calibri"/>
+                <w:sz w:val="19"/>
+                <w:szCs w:val="19"/>
+              </w:rPr>
+              <w:t xml:space="preserve"> injection</w:t>
             </w:r>
           </w:p>
         </w:tc>
@@ -937,14 +1207,25 @@
               </w:rPr>
               <w:t xml:space="preserve"> </w:t>
             </w:r>
-            <w:r>
-              <w:rPr>
-                <w:rFonts w:ascii="Calibri" w:eastAsia="Calibri" w:hAnsi="Calibri" w:cs="Calibri"/>
-                <w:sz w:val="18"/>
-                <w:szCs w:val="18"/>
-                <w:lang w:val="en-US"/>
-              </w:rPr>
-              <w:t xml:space="preserve">/  R </w:t>
+            <w:proofErr w:type="gramStart"/>
+            <w:r>
+              <w:rPr>
+                <w:rFonts w:ascii="Calibri" w:eastAsia="Calibri" w:hAnsi="Calibri" w:cs="Calibri"/>
+                <w:sz w:val="18"/>
+                <w:szCs w:val="18"/>
+                <w:lang w:val="en-US"/>
+              </w:rPr>
+              <w:t>/  R</w:t>
+            </w:r>
+            <w:proofErr w:type="gramEnd"/>
+            <w:r>
+              <w:rPr>
+                <w:rFonts w:ascii="Calibri" w:eastAsia="Calibri" w:hAnsi="Calibri" w:cs="Calibri"/>
+                <w:sz w:val="18"/>
+                <w:szCs w:val="18"/>
+                <w:lang w:val="en-US"/>
+              </w:rPr>
+              <w:t xml:space="preserve"> </w:t>
             </w:r>
             <w:r>
               <w:rPr>
@@ -1019,8 +1300,20 @@
                 <w:sz w:val="18"/>
                 <w:szCs w:val="18"/>
               </w:rPr>
-              <w:t>CRISPR or TALEN Sequence</w:t>
-            </w:r>
+              <w:t xml:space="preserve">CRISPR or TALEN </w:t>
+            </w:r>
+            <w:proofErr w:type="spellStart"/>
+            <w:r>
+              <w:rPr>
+                <w:rFonts w:ascii="Calibri" w:eastAsia="Calibri" w:hAnsi="Calibri" w:cs="Calibri"/>
+                <w:b/>
+                <w:bCs/>
+                <w:sz w:val="18"/>
+                <w:szCs w:val="18"/>
+              </w:rPr>
+              <w:t>Sequence</w:t>
+            </w:r>
+            <w:proofErr w:type="spellEnd"/>
           </w:p>
         </w:tc>
         <w:tc>
@@ -1131,15 +1424,27 @@
             <w:pPr>
               <w:keepNext/>
             </w:pPr>
-            <w:r>
-              <w:rPr>
-                <w:rFonts w:ascii="Calibri" w:eastAsia="Calibri" w:hAnsi="Calibri" w:cs="Calibri"/>
-                <w:b/>
-                <w:bCs/>
-                <w:sz w:val="18"/>
-                <w:szCs w:val="18"/>
-              </w:rPr>
-              <w:t>Genetic Background</w:t>
+            <w:proofErr w:type="spellStart"/>
+            <w:r>
+              <w:rPr>
+                <w:rFonts w:ascii="Calibri" w:eastAsia="Calibri" w:hAnsi="Calibri" w:cs="Calibri"/>
+                <w:b/>
+                <w:bCs/>
+                <w:sz w:val="18"/>
+                <w:szCs w:val="18"/>
+              </w:rPr>
+              <w:t>Genetic</w:t>
+            </w:r>
+            <w:proofErr w:type="spellEnd"/>
+            <w:r>
+              <w:rPr>
+                <w:rFonts w:ascii="Calibri" w:eastAsia="Calibri" w:hAnsi="Calibri" w:cs="Calibri"/>
+                <w:b/>
+                <w:bCs/>
+                <w:sz w:val="18"/>
+                <w:szCs w:val="18"/>
+              </w:rPr>
+              <w:t xml:space="preserve"> Background</w:t>
             </w:r>
           </w:p>
         </w:tc>
@@ -1195,7 +1500,29 @@
                 <w:sz w:val="18"/>
                 <w:szCs w:val="18"/>
               </w:rPr>
-              <w:t>Gene or Construct Name</w:t>
+              <w:t xml:space="preserve">Gene or </w:t>
+            </w:r>
+            <w:proofErr w:type="spellStart"/>
+            <w:r>
+              <w:rPr>
+                <w:rFonts w:ascii="Calibri" w:eastAsia="Calibri" w:hAnsi="Calibri" w:cs="Calibri"/>
+                <w:b/>
+                <w:bCs/>
+                <w:sz w:val="18"/>
+                <w:szCs w:val="18"/>
+              </w:rPr>
+              <w:t>Construct</w:t>
+            </w:r>
+            <w:proofErr w:type="spellEnd"/>
+            <w:r>
+              <w:rPr>
+                <w:rFonts w:ascii="Calibri" w:eastAsia="Calibri" w:hAnsi="Calibri" w:cs="Calibri"/>
+                <w:b/>
+                <w:bCs/>
+                <w:sz w:val="18"/>
+                <w:szCs w:val="18"/>
+              </w:rPr>
+              <w:t xml:space="preserve"> Name</w:t>
             </w:r>
           </w:p>
         </w:tc>
@@ -1213,13 +1540,43 @@
             <w:pPr>
               <w:keepNext/>
             </w:pPr>
-            <w:r>
-              <w:rPr>
-                <w:rFonts w:ascii="Calibri" w:eastAsia="Calibri" w:hAnsi="Calibri" w:cs="Calibri"/>
-                <w:sz w:val="19"/>
-                <w:szCs w:val="19"/>
-              </w:rPr>
-              <w:t>melatonin receptor 1A b</w:t>
+            <w:proofErr w:type="spellStart"/>
+            <w:proofErr w:type="gramStart"/>
+            <w:r>
+              <w:rPr>
+                <w:rFonts w:ascii="Calibri" w:eastAsia="Calibri" w:hAnsi="Calibri" w:cs="Calibri"/>
+                <w:sz w:val="19"/>
+                <w:szCs w:val="19"/>
+              </w:rPr>
+              <w:t>melatonin</w:t>
+            </w:r>
+            <w:proofErr w:type="spellEnd"/>
+            <w:proofErr w:type="gramEnd"/>
+            <w:r>
+              <w:rPr>
+                <w:rFonts w:ascii="Calibri" w:eastAsia="Calibri" w:hAnsi="Calibri" w:cs="Calibri"/>
+                <w:sz w:val="19"/>
+                <w:szCs w:val="19"/>
+              </w:rPr>
+              <w:t xml:space="preserve"> </w:t>
+            </w:r>
+            <w:proofErr w:type="spellStart"/>
+            <w:r>
+              <w:rPr>
+                <w:rFonts w:ascii="Calibri" w:eastAsia="Calibri" w:hAnsi="Calibri" w:cs="Calibri"/>
+                <w:sz w:val="19"/>
+                <w:szCs w:val="19"/>
+              </w:rPr>
+              <w:t>receptor</w:t>
+            </w:r>
+            <w:proofErr w:type="spellEnd"/>
+            <w:r>
+              <w:rPr>
+                <w:rFonts w:ascii="Calibri" w:eastAsia="Calibri" w:hAnsi="Calibri" w:cs="Calibri"/>
+                <w:sz w:val="19"/>
+                <w:szCs w:val="19"/>
+              </w:rPr>
+              <w:t xml:space="preserve"> 1A b</w:t>
             </w:r>
           </w:p>
         </w:tc>
@@ -1269,6 +1626,7 @@
             <w:pPr>
               <w:keepNext/>
             </w:pPr>
+            <w:proofErr w:type="gramStart"/>
             <w:r>
               <w:rPr>
                 <w:rFonts w:ascii="Calibri" w:eastAsia="Calibri" w:hAnsi="Calibri" w:cs="Calibri"/>
@@ -1277,7 +1635,18 @@
                 <w:sz w:val="19"/>
                 <w:szCs w:val="19"/>
               </w:rPr>
-              <w:t>mtnr1ab</w:t>
+              <w:t>mtnr</w:t>
+            </w:r>
+            <w:proofErr w:type="gramEnd"/>
+            <w:r>
+              <w:rPr>
+                <w:rFonts w:ascii="Calibri" w:eastAsia="Calibri" w:hAnsi="Calibri" w:cs="Calibri"/>
+                <w:i/>
+                <w:iCs/>
+                <w:sz w:val="19"/>
+                <w:szCs w:val="19"/>
+              </w:rPr>
+              <w:t>1ab</w:t>
             </w:r>
             <w:r>
               <w:rPr>
@@ -1309,16 +1678,40 @@
             <w:pPr>
               <w:keepNext/>
             </w:pPr>
-            <w:r>
-              <w:rPr>
-                <w:rFonts w:ascii="Calibri" w:eastAsia="Calibri" w:hAnsi="Calibri" w:cs="Calibri"/>
-                <w:b/>
-                <w:bCs/>
-                <w:sz w:val="18"/>
-                <w:szCs w:val="18"/>
-              </w:rPr>
-              <w:t>Allele/Line Designation</w:t>
-            </w:r>
+            <w:proofErr w:type="spellStart"/>
+            <w:r>
+              <w:rPr>
+                <w:rFonts w:ascii="Calibri" w:eastAsia="Calibri" w:hAnsi="Calibri" w:cs="Calibri"/>
+                <w:b/>
+                <w:bCs/>
+                <w:sz w:val="18"/>
+                <w:szCs w:val="18"/>
+              </w:rPr>
+              <w:t>Allele</w:t>
+            </w:r>
+            <w:proofErr w:type="spellEnd"/>
+            <w:r>
+              <w:rPr>
+                <w:rFonts w:ascii="Calibri" w:eastAsia="Calibri" w:hAnsi="Calibri" w:cs="Calibri"/>
+                <w:b/>
+                <w:bCs/>
+                <w:sz w:val="18"/>
+                <w:szCs w:val="18"/>
+              </w:rPr>
+              <w:t xml:space="preserve">/Line </w:t>
+            </w:r>
+            <w:proofErr w:type="spellStart"/>
+            <w:r>
+              <w:rPr>
+                <w:rFonts w:ascii="Calibri" w:eastAsia="Calibri" w:hAnsi="Calibri" w:cs="Calibri"/>
+                <w:b/>
+                <w:bCs/>
+                <w:sz w:val="18"/>
+                <w:szCs w:val="18"/>
+              </w:rPr>
+              <w:t>Designation</w:t>
+            </w:r>
+            <w:proofErr w:type="spellEnd"/>
           </w:p>
         </w:tc>
         <w:tc>
@@ -1335,13 +1728,23 @@
             <w:pPr>
               <w:keepNext/>
             </w:pPr>
-            <w:r>
-              <w:rPr>
-                <w:rFonts w:ascii="Calibri" w:eastAsia="Calibri" w:hAnsi="Calibri" w:cs="Calibri"/>
-                <w:sz w:val="19"/>
-                <w:szCs w:val="19"/>
-              </w:rPr>
-              <w:t>ly2</w:t>
+            <w:proofErr w:type="gramStart"/>
+            <w:r>
+              <w:rPr>
+                <w:rFonts w:ascii="Calibri" w:eastAsia="Calibri" w:hAnsi="Calibri" w:cs="Calibri"/>
+                <w:sz w:val="19"/>
+                <w:szCs w:val="19"/>
+              </w:rPr>
+              <w:t>ly</w:t>
+            </w:r>
+            <w:proofErr w:type="gramEnd"/>
+            <w:r>
+              <w:rPr>
+                <w:rFonts w:ascii="Calibri" w:eastAsia="Calibri" w:hAnsi="Calibri" w:cs="Calibri"/>
+                <w:sz w:val="19"/>
+                <w:szCs w:val="19"/>
+              </w:rPr>
+              <w:t>2</w:t>
             </w:r>
           </w:p>
         </w:tc>
@@ -1397,7 +1800,25 @@
                 <w:sz w:val="19"/>
                 <w:szCs w:val="19"/>
               </w:rPr>
-              <w:t>Cas9 protein injection</w:t>
+              <w:t xml:space="preserve">Cas9 </w:t>
+            </w:r>
+            <w:proofErr w:type="spellStart"/>
+            <w:r>
+              <w:rPr>
+                <w:rFonts w:ascii="Calibri" w:eastAsia="Calibri" w:hAnsi="Calibri" w:cs="Calibri"/>
+                <w:sz w:val="19"/>
+                <w:szCs w:val="19"/>
+              </w:rPr>
+              <w:t>protein</w:t>
+            </w:r>
+            <w:proofErr w:type="spellEnd"/>
+            <w:r>
+              <w:rPr>
+                <w:rFonts w:ascii="Calibri" w:eastAsia="Calibri" w:hAnsi="Calibri" w:cs="Calibri"/>
+                <w:sz w:val="19"/>
+                <w:szCs w:val="19"/>
+              </w:rPr>
+              <w:t xml:space="preserve"> injection</w:t>
             </w:r>
           </w:p>
         </w:tc>
@@ -1674,6 +2095,7 @@
               </w:rPr>
               <w:t xml:space="preserve">F </w:t>
             </w:r>
+            <w:proofErr w:type="gramStart"/>
             <w:r>
               <w:rPr>
                 <w:rFonts w:ascii="Courier New" w:eastAsia="Courier New" w:hAnsi="Courier New" w:cs="Courier New"/>
@@ -1690,7 +2112,17 @@
                 <w:szCs w:val="18"/>
                 <w:lang w:val="en-US"/>
               </w:rPr>
-              <w:t xml:space="preserve">  /  R </w:t>
+              <w:t xml:space="preserve">  /</w:t>
+            </w:r>
+            <w:proofErr w:type="gramEnd"/>
+            <w:r>
+              <w:rPr>
+                <w:rFonts w:ascii="Calibri" w:eastAsia="Calibri" w:hAnsi="Calibri" w:cs="Calibri"/>
+                <w:sz w:val="18"/>
+                <w:szCs w:val="18"/>
+                <w:lang w:val="en-US"/>
+              </w:rPr>
+              <w:t xml:space="preserve">  R </w:t>
             </w:r>
             <w:r>
               <w:rPr>
@@ -1756,8 +2188,20 @@
                 <w:sz w:val="18"/>
                 <w:szCs w:val="18"/>
               </w:rPr>
-              <w:t>CRISPR or TALEN Sequence</w:t>
-            </w:r>
+              <w:t xml:space="preserve">CRISPR or TALEN </w:t>
+            </w:r>
+            <w:proofErr w:type="spellStart"/>
+            <w:r>
+              <w:rPr>
+                <w:rFonts w:ascii="Calibri" w:eastAsia="Calibri" w:hAnsi="Calibri" w:cs="Calibri"/>
+                <w:b/>
+                <w:bCs/>
+                <w:sz w:val="18"/>
+                <w:szCs w:val="18"/>
+              </w:rPr>
+              <w:t>Sequence</w:t>
+            </w:r>
+            <w:proofErr w:type="spellEnd"/>
           </w:p>
         </w:tc>
         <w:tc>
@@ -1867,15 +2311,27 @@
             <w:pPr>
               <w:keepNext/>
             </w:pPr>
-            <w:r>
-              <w:rPr>
-                <w:rFonts w:ascii="Calibri" w:eastAsia="Calibri" w:hAnsi="Calibri" w:cs="Calibri"/>
-                <w:b/>
-                <w:bCs/>
-                <w:sz w:val="18"/>
-                <w:szCs w:val="18"/>
-              </w:rPr>
-              <w:t>Genetic Background</w:t>
+            <w:proofErr w:type="spellStart"/>
+            <w:r>
+              <w:rPr>
+                <w:rFonts w:ascii="Calibri" w:eastAsia="Calibri" w:hAnsi="Calibri" w:cs="Calibri"/>
+                <w:b/>
+                <w:bCs/>
+                <w:sz w:val="18"/>
+                <w:szCs w:val="18"/>
+              </w:rPr>
+              <w:t>Genetic</w:t>
+            </w:r>
+            <w:proofErr w:type="spellEnd"/>
+            <w:r>
+              <w:rPr>
+                <w:rFonts w:ascii="Calibri" w:eastAsia="Calibri" w:hAnsi="Calibri" w:cs="Calibri"/>
+                <w:b/>
+                <w:bCs/>
+                <w:sz w:val="18"/>
+                <w:szCs w:val="18"/>
+              </w:rPr>
+              <w:t xml:space="preserve"> Background</w:t>
             </w:r>
           </w:p>
         </w:tc>
@@ -1931,7 +2387,29 @@
                 <w:sz w:val="18"/>
                 <w:szCs w:val="18"/>
               </w:rPr>
-              <w:t>Gene or Construct Name</w:t>
+              <w:t xml:space="preserve">Gene or </w:t>
+            </w:r>
+            <w:proofErr w:type="spellStart"/>
+            <w:r>
+              <w:rPr>
+                <w:rFonts w:ascii="Calibri" w:eastAsia="Calibri" w:hAnsi="Calibri" w:cs="Calibri"/>
+                <w:b/>
+                <w:bCs/>
+                <w:sz w:val="18"/>
+                <w:szCs w:val="18"/>
+              </w:rPr>
+              <w:t>Construct</w:t>
+            </w:r>
+            <w:proofErr w:type="spellEnd"/>
+            <w:r>
+              <w:rPr>
+                <w:rFonts w:ascii="Calibri" w:eastAsia="Calibri" w:hAnsi="Calibri" w:cs="Calibri"/>
+                <w:b/>
+                <w:bCs/>
+                <w:sz w:val="18"/>
+                <w:szCs w:val="18"/>
+              </w:rPr>
+              <w:t xml:space="preserve"> Name</w:t>
             </w:r>
           </w:p>
         </w:tc>
@@ -2009,6 +2487,7 @@
             <w:pPr>
               <w:keepNext/>
             </w:pPr>
+            <w:proofErr w:type="gramStart"/>
             <w:r>
               <w:rPr>
                 <w:rFonts w:ascii="Calibri" w:eastAsia="Calibri" w:hAnsi="Calibri" w:cs="Calibri"/>
@@ -2017,7 +2496,18 @@
                 <w:sz w:val="19"/>
                 <w:szCs w:val="19"/>
               </w:rPr>
-              <w:t>mtnr1al</w:t>
+              <w:t>mtnr</w:t>
+            </w:r>
+            <w:proofErr w:type="gramEnd"/>
+            <w:r>
+              <w:rPr>
+                <w:rFonts w:ascii="Calibri" w:eastAsia="Calibri" w:hAnsi="Calibri" w:cs="Calibri"/>
+                <w:i/>
+                <w:iCs/>
+                <w:sz w:val="19"/>
+                <w:szCs w:val="19"/>
+              </w:rPr>
+              <w:t>1al</w:t>
             </w:r>
             <w:r>
               <w:rPr>
@@ -2049,16 +2539,40 @@
             <w:pPr>
               <w:keepNext/>
             </w:pPr>
-            <w:r>
-              <w:rPr>
-                <w:rFonts w:ascii="Calibri" w:eastAsia="Calibri" w:hAnsi="Calibri" w:cs="Calibri"/>
-                <w:b/>
-                <w:bCs/>
-                <w:sz w:val="18"/>
-                <w:szCs w:val="18"/>
-              </w:rPr>
-              <w:t>Allele/Line Designation</w:t>
-            </w:r>
+            <w:proofErr w:type="spellStart"/>
+            <w:r>
+              <w:rPr>
+                <w:rFonts w:ascii="Calibri" w:eastAsia="Calibri" w:hAnsi="Calibri" w:cs="Calibri"/>
+                <w:b/>
+                <w:bCs/>
+                <w:sz w:val="18"/>
+                <w:szCs w:val="18"/>
+              </w:rPr>
+              <w:t>Allele</w:t>
+            </w:r>
+            <w:proofErr w:type="spellEnd"/>
+            <w:r>
+              <w:rPr>
+                <w:rFonts w:ascii="Calibri" w:eastAsia="Calibri" w:hAnsi="Calibri" w:cs="Calibri"/>
+                <w:b/>
+                <w:bCs/>
+                <w:sz w:val="18"/>
+                <w:szCs w:val="18"/>
+              </w:rPr>
+              <w:t xml:space="preserve">/Line </w:t>
+            </w:r>
+            <w:proofErr w:type="spellStart"/>
+            <w:r>
+              <w:rPr>
+                <w:rFonts w:ascii="Calibri" w:eastAsia="Calibri" w:hAnsi="Calibri" w:cs="Calibri"/>
+                <w:b/>
+                <w:bCs/>
+                <w:sz w:val="18"/>
+                <w:szCs w:val="18"/>
+              </w:rPr>
+              <w:t>Designation</w:t>
+            </w:r>
+            <w:proofErr w:type="spellEnd"/>
           </w:p>
         </w:tc>
         <w:tc>
@@ -2075,13 +2589,23 @@
             <w:pPr>
               <w:keepNext/>
             </w:pPr>
-            <w:r>
-              <w:rPr>
-                <w:rFonts w:ascii="Calibri" w:eastAsia="Calibri" w:hAnsi="Calibri" w:cs="Calibri"/>
-                <w:sz w:val="19"/>
-                <w:szCs w:val="19"/>
-              </w:rPr>
-              <w:t>ly3</w:t>
+            <w:proofErr w:type="gramStart"/>
+            <w:r>
+              <w:rPr>
+                <w:rFonts w:ascii="Calibri" w:eastAsia="Calibri" w:hAnsi="Calibri" w:cs="Calibri"/>
+                <w:sz w:val="19"/>
+                <w:szCs w:val="19"/>
+              </w:rPr>
+              <w:t>ly</w:t>
+            </w:r>
+            <w:proofErr w:type="gramEnd"/>
+            <w:r>
+              <w:rPr>
+                <w:rFonts w:ascii="Calibri" w:eastAsia="Calibri" w:hAnsi="Calibri" w:cs="Calibri"/>
+                <w:sz w:val="19"/>
+                <w:szCs w:val="19"/>
+              </w:rPr>
+              <w:t>3</w:t>
             </w:r>
           </w:p>
         </w:tc>
@@ -2137,7 +2661,25 @@
                 <w:sz w:val="19"/>
                 <w:szCs w:val="19"/>
               </w:rPr>
-              <w:t>Cas9 protein injection</w:t>
+              <w:t xml:space="preserve">Cas9 </w:t>
+            </w:r>
+            <w:proofErr w:type="spellStart"/>
+            <w:r>
+              <w:rPr>
+                <w:rFonts w:ascii="Calibri" w:eastAsia="Calibri" w:hAnsi="Calibri" w:cs="Calibri"/>
+                <w:sz w:val="19"/>
+                <w:szCs w:val="19"/>
+              </w:rPr>
+              <w:t>protein</w:t>
+            </w:r>
+            <w:proofErr w:type="spellEnd"/>
+            <w:r>
+              <w:rPr>
+                <w:rFonts w:ascii="Calibri" w:eastAsia="Calibri" w:hAnsi="Calibri" w:cs="Calibri"/>
+                <w:sz w:val="19"/>
+                <w:szCs w:val="19"/>
+              </w:rPr>
+              <w:t xml:space="preserve"> injection</w:t>
             </w:r>
           </w:p>
         </w:tc>
@@ -2374,6 +2916,7 @@
               </w:rPr>
               <w:t xml:space="preserve">F </w:t>
             </w:r>
+            <w:proofErr w:type="gramStart"/>
             <w:r>
               <w:rPr>
                 <w:rFonts w:ascii="Courier New" w:eastAsia="Courier New" w:hAnsi="Courier New" w:cs="Courier New"/>
@@ -2390,7 +2933,17 @@
                 <w:szCs w:val="18"/>
                 <w:lang w:val="en-US"/>
               </w:rPr>
-              <w:t xml:space="preserve">  /  R </w:t>
+              <w:t xml:space="preserve">  /</w:t>
+            </w:r>
+            <w:proofErr w:type="gramEnd"/>
+            <w:r>
+              <w:rPr>
+                <w:rFonts w:ascii="Calibri" w:eastAsia="Calibri" w:hAnsi="Calibri" w:cs="Calibri"/>
+                <w:sz w:val="18"/>
+                <w:szCs w:val="18"/>
+                <w:lang w:val="en-US"/>
+              </w:rPr>
+              <w:t xml:space="preserve">  R </w:t>
             </w:r>
             <w:r>
               <w:rPr>
@@ -2456,8 +3009,20 @@
                 <w:sz w:val="18"/>
                 <w:szCs w:val="18"/>
               </w:rPr>
-              <w:t>CRISPR or TALEN Sequence</w:t>
-            </w:r>
+              <w:t xml:space="preserve">CRISPR or TALEN </w:t>
+            </w:r>
+            <w:proofErr w:type="spellStart"/>
+            <w:r>
+              <w:rPr>
+                <w:rFonts w:ascii="Calibri" w:eastAsia="Calibri" w:hAnsi="Calibri" w:cs="Calibri"/>
+                <w:b/>
+                <w:bCs/>
+                <w:sz w:val="18"/>
+                <w:szCs w:val="18"/>
+              </w:rPr>
+              <w:t>Sequence</w:t>
+            </w:r>
+            <w:proofErr w:type="spellEnd"/>
           </w:p>
         </w:tc>
         <w:tc>
@@ -2581,15 +3146,27 @@
             <w:pPr>
               <w:keepNext/>
             </w:pPr>
-            <w:r>
-              <w:rPr>
-                <w:rFonts w:ascii="Calibri" w:eastAsia="Calibri" w:hAnsi="Calibri" w:cs="Calibri"/>
-                <w:b/>
-                <w:bCs/>
-                <w:sz w:val="18"/>
-                <w:szCs w:val="18"/>
-              </w:rPr>
-              <w:t>Genetic Background</w:t>
+            <w:proofErr w:type="spellStart"/>
+            <w:r>
+              <w:rPr>
+                <w:rFonts w:ascii="Calibri" w:eastAsia="Calibri" w:hAnsi="Calibri" w:cs="Calibri"/>
+                <w:b/>
+                <w:bCs/>
+                <w:sz w:val="18"/>
+                <w:szCs w:val="18"/>
+              </w:rPr>
+              <w:t>Genetic</w:t>
+            </w:r>
+            <w:proofErr w:type="spellEnd"/>
+            <w:r>
+              <w:rPr>
+                <w:rFonts w:ascii="Calibri" w:eastAsia="Calibri" w:hAnsi="Calibri" w:cs="Calibri"/>
+                <w:b/>
+                <w:bCs/>
+                <w:sz w:val="18"/>
+                <w:szCs w:val="18"/>
+              </w:rPr>
+              <w:t xml:space="preserve"> Background</w:t>
             </w:r>
           </w:p>
         </w:tc>
@@ -2645,7 +3222,29 @@
                 <w:sz w:val="18"/>
                 <w:szCs w:val="18"/>
               </w:rPr>
-              <w:t>Gene or Construct Name</w:t>
+              <w:t xml:space="preserve">Gene or </w:t>
+            </w:r>
+            <w:proofErr w:type="spellStart"/>
+            <w:r>
+              <w:rPr>
+                <w:rFonts w:ascii="Calibri" w:eastAsia="Calibri" w:hAnsi="Calibri" w:cs="Calibri"/>
+                <w:b/>
+                <w:bCs/>
+                <w:sz w:val="18"/>
+                <w:szCs w:val="18"/>
+              </w:rPr>
+              <w:t>Construct</w:t>
+            </w:r>
+            <w:proofErr w:type="spellEnd"/>
+            <w:r>
+              <w:rPr>
+                <w:rFonts w:ascii="Calibri" w:eastAsia="Calibri" w:hAnsi="Calibri" w:cs="Calibri"/>
+                <w:b/>
+                <w:bCs/>
+                <w:sz w:val="18"/>
+                <w:szCs w:val="18"/>
+              </w:rPr>
+              <w:t xml:space="preserve"> Name</w:t>
             </w:r>
           </w:p>
         </w:tc>
@@ -2663,13 +3262,43 @@
             <w:pPr>
               <w:keepNext/>
             </w:pPr>
-            <w:r>
-              <w:rPr>
-                <w:rFonts w:ascii="Calibri" w:eastAsia="Calibri" w:hAnsi="Calibri" w:cs="Calibri"/>
-                <w:sz w:val="19"/>
-                <w:szCs w:val="19"/>
-              </w:rPr>
-              <w:t>melatonin receptor type 1Ba</w:t>
+            <w:proofErr w:type="spellStart"/>
+            <w:proofErr w:type="gramStart"/>
+            <w:r>
+              <w:rPr>
+                <w:rFonts w:ascii="Calibri" w:eastAsia="Calibri" w:hAnsi="Calibri" w:cs="Calibri"/>
+                <w:sz w:val="19"/>
+                <w:szCs w:val="19"/>
+              </w:rPr>
+              <w:t>melatonin</w:t>
+            </w:r>
+            <w:proofErr w:type="spellEnd"/>
+            <w:proofErr w:type="gramEnd"/>
+            <w:r>
+              <w:rPr>
+                <w:rFonts w:ascii="Calibri" w:eastAsia="Calibri" w:hAnsi="Calibri" w:cs="Calibri"/>
+                <w:sz w:val="19"/>
+                <w:szCs w:val="19"/>
+              </w:rPr>
+              <w:t xml:space="preserve"> </w:t>
+            </w:r>
+            <w:proofErr w:type="spellStart"/>
+            <w:r>
+              <w:rPr>
+                <w:rFonts w:ascii="Calibri" w:eastAsia="Calibri" w:hAnsi="Calibri" w:cs="Calibri"/>
+                <w:sz w:val="19"/>
+                <w:szCs w:val="19"/>
+              </w:rPr>
+              <w:t>receptor</w:t>
+            </w:r>
+            <w:proofErr w:type="spellEnd"/>
+            <w:r>
+              <w:rPr>
+                <w:rFonts w:ascii="Calibri" w:eastAsia="Calibri" w:hAnsi="Calibri" w:cs="Calibri"/>
+                <w:sz w:val="19"/>
+                <w:szCs w:val="19"/>
+              </w:rPr>
+              <w:t xml:space="preserve"> type 1Ba</w:t>
             </w:r>
           </w:p>
         </w:tc>
@@ -2719,6 +3348,7 @@
             <w:pPr>
               <w:keepNext/>
             </w:pPr>
+            <w:proofErr w:type="gramStart"/>
             <w:r>
               <w:rPr>
                 <w:rFonts w:ascii="Calibri" w:eastAsia="Calibri" w:hAnsi="Calibri" w:cs="Calibri"/>
@@ -2727,7 +3357,18 @@
                 <w:sz w:val="19"/>
                 <w:szCs w:val="19"/>
               </w:rPr>
-              <w:t>mtnr1ba</w:t>
+              <w:t>mtnr</w:t>
+            </w:r>
+            <w:proofErr w:type="gramEnd"/>
+            <w:r>
+              <w:rPr>
+                <w:rFonts w:ascii="Calibri" w:eastAsia="Calibri" w:hAnsi="Calibri" w:cs="Calibri"/>
+                <w:i/>
+                <w:iCs/>
+                <w:sz w:val="19"/>
+                <w:szCs w:val="19"/>
+              </w:rPr>
+              <w:t>1ba</w:t>
             </w:r>
             <w:r>
               <w:rPr>
@@ -2759,16 +3400,40 @@
             <w:pPr>
               <w:keepNext/>
             </w:pPr>
-            <w:r>
-              <w:rPr>
-                <w:rFonts w:ascii="Calibri" w:eastAsia="Calibri" w:hAnsi="Calibri" w:cs="Calibri"/>
-                <w:b/>
-                <w:bCs/>
-                <w:sz w:val="18"/>
-                <w:szCs w:val="18"/>
-              </w:rPr>
-              <w:t>Allele/Line Designation</w:t>
-            </w:r>
+            <w:proofErr w:type="spellStart"/>
+            <w:r>
+              <w:rPr>
+                <w:rFonts w:ascii="Calibri" w:eastAsia="Calibri" w:hAnsi="Calibri" w:cs="Calibri"/>
+                <w:b/>
+                <w:bCs/>
+                <w:sz w:val="18"/>
+                <w:szCs w:val="18"/>
+              </w:rPr>
+              <w:t>Allele</w:t>
+            </w:r>
+            <w:proofErr w:type="spellEnd"/>
+            <w:r>
+              <w:rPr>
+                <w:rFonts w:ascii="Calibri" w:eastAsia="Calibri" w:hAnsi="Calibri" w:cs="Calibri"/>
+                <w:b/>
+                <w:bCs/>
+                <w:sz w:val="18"/>
+                <w:szCs w:val="18"/>
+              </w:rPr>
+              <w:t xml:space="preserve">/Line </w:t>
+            </w:r>
+            <w:proofErr w:type="spellStart"/>
+            <w:r>
+              <w:rPr>
+                <w:rFonts w:ascii="Calibri" w:eastAsia="Calibri" w:hAnsi="Calibri" w:cs="Calibri"/>
+                <w:b/>
+                <w:bCs/>
+                <w:sz w:val="18"/>
+                <w:szCs w:val="18"/>
+              </w:rPr>
+              <w:t>Designation</w:t>
+            </w:r>
+            <w:proofErr w:type="spellEnd"/>
           </w:p>
         </w:tc>
         <w:tc>
@@ -2785,13 +3450,23 @@
             <w:pPr>
               <w:keepNext/>
             </w:pPr>
-            <w:r>
-              <w:rPr>
-                <w:rFonts w:ascii="Calibri" w:eastAsia="Calibri" w:hAnsi="Calibri" w:cs="Calibri"/>
-                <w:sz w:val="19"/>
-                <w:szCs w:val="19"/>
-              </w:rPr>
-              <w:t>ly4</w:t>
+            <w:proofErr w:type="gramStart"/>
+            <w:r>
+              <w:rPr>
+                <w:rFonts w:ascii="Calibri" w:eastAsia="Calibri" w:hAnsi="Calibri" w:cs="Calibri"/>
+                <w:sz w:val="19"/>
+                <w:szCs w:val="19"/>
+              </w:rPr>
+              <w:t>ly</w:t>
+            </w:r>
+            <w:proofErr w:type="gramEnd"/>
+            <w:r>
+              <w:rPr>
+                <w:rFonts w:ascii="Calibri" w:eastAsia="Calibri" w:hAnsi="Calibri" w:cs="Calibri"/>
+                <w:sz w:val="19"/>
+                <w:szCs w:val="19"/>
+              </w:rPr>
+              <w:t>4</w:t>
             </w:r>
           </w:p>
         </w:tc>
@@ -2847,7 +3522,25 @@
                 <w:sz w:val="19"/>
                 <w:szCs w:val="19"/>
               </w:rPr>
-              <w:t>Cas9 protein injection</w:t>
+              <w:t xml:space="preserve">Cas9 </w:t>
+            </w:r>
+            <w:proofErr w:type="spellStart"/>
+            <w:r>
+              <w:rPr>
+                <w:rFonts w:ascii="Calibri" w:eastAsia="Calibri" w:hAnsi="Calibri" w:cs="Calibri"/>
+                <w:sz w:val="19"/>
+                <w:szCs w:val="19"/>
+              </w:rPr>
+              <w:t>protein</w:t>
+            </w:r>
+            <w:proofErr w:type="spellEnd"/>
+            <w:r>
+              <w:rPr>
+                <w:rFonts w:ascii="Calibri" w:eastAsia="Calibri" w:hAnsi="Calibri" w:cs="Calibri"/>
+                <w:sz w:val="19"/>
+                <w:szCs w:val="19"/>
+              </w:rPr>
+              <w:t xml:space="preserve"> injection</w:t>
             </w:r>
           </w:p>
         </w:tc>
@@ -3124,6 +3817,7 @@
               </w:rPr>
               <w:t xml:space="preserve">F </w:t>
             </w:r>
+            <w:proofErr w:type="gramStart"/>
             <w:r>
               <w:rPr>
                 <w:rFonts w:ascii="Courier New" w:eastAsia="Courier New" w:hAnsi="Courier New" w:cs="Courier New"/>
@@ -3140,7 +3834,17 @@
                 <w:szCs w:val="18"/>
                 <w:lang w:val="en-US"/>
               </w:rPr>
-              <w:t xml:space="preserve">  /  R </w:t>
+              <w:t xml:space="preserve">  /</w:t>
+            </w:r>
+            <w:proofErr w:type="gramEnd"/>
+            <w:r>
+              <w:rPr>
+                <w:rFonts w:ascii="Calibri" w:eastAsia="Calibri" w:hAnsi="Calibri" w:cs="Calibri"/>
+                <w:sz w:val="18"/>
+                <w:szCs w:val="18"/>
+                <w:lang w:val="en-US"/>
+              </w:rPr>
+              <w:t xml:space="preserve">  R </w:t>
             </w:r>
             <w:r>
               <w:rPr>
@@ -3206,8 +3910,20 @@
                 <w:sz w:val="18"/>
                 <w:szCs w:val="18"/>
               </w:rPr>
-              <w:t>CRISPR or TALEN Sequence</w:t>
-            </w:r>
+              <w:t xml:space="preserve">CRISPR or TALEN </w:t>
+            </w:r>
+            <w:proofErr w:type="spellStart"/>
+            <w:r>
+              <w:rPr>
+                <w:rFonts w:ascii="Calibri" w:eastAsia="Calibri" w:hAnsi="Calibri" w:cs="Calibri"/>
+                <w:b/>
+                <w:bCs/>
+                <w:sz w:val="18"/>
+                <w:szCs w:val="18"/>
+              </w:rPr>
+              <w:t>Sequence</w:t>
+            </w:r>
+            <w:proofErr w:type="spellEnd"/>
           </w:p>
         </w:tc>
         <w:tc>
@@ -3344,15 +4060,27 @@
             <w:pPr>
               <w:keepNext/>
             </w:pPr>
-            <w:r>
-              <w:rPr>
-                <w:rFonts w:ascii="Calibri" w:eastAsia="Calibri" w:hAnsi="Calibri" w:cs="Calibri"/>
-                <w:b/>
-                <w:bCs/>
-                <w:sz w:val="18"/>
-                <w:szCs w:val="18"/>
-              </w:rPr>
-              <w:t>Genetic Background</w:t>
+            <w:proofErr w:type="spellStart"/>
+            <w:r>
+              <w:rPr>
+                <w:rFonts w:ascii="Calibri" w:eastAsia="Calibri" w:hAnsi="Calibri" w:cs="Calibri"/>
+                <w:b/>
+                <w:bCs/>
+                <w:sz w:val="18"/>
+                <w:szCs w:val="18"/>
+              </w:rPr>
+              <w:t>Genetic</w:t>
+            </w:r>
+            <w:proofErr w:type="spellEnd"/>
+            <w:r>
+              <w:rPr>
+                <w:rFonts w:ascii="Calibri" w:eastAsia="Calibri" w:hAnsi="Calibri" w:cs="Calibri"/>
+                <w:b/>
+                <w:bCs/>
+                <w:sz w:val="18"/>
+                <w:szCs w:val="18"/>
+              </w:rPr>
+              <w:t xml:space="preserve"> Background</w:t>
             </w:r>
           </w:p>
         </w:tc>
@@ -3408,7 +4136,29 @@
                 <w:sz w:val="18"/>
                 <w:szCs w:val="18"/>
               </w:rPr>
-              <w:t>Gene or Construct Name</w:t>
+              <w:t xml:space="preserve">Gene or </w:t>
+            </w:r>
+            <w:proofErr w:type="spellStart"/>
+            <w:r>
+              <w:rPr>
+                <w:rFonts w:ascii="Calibri" w:eastAsia="Calibri" w:hAnsi="Calibri" w:cs="Calibri"/>
+                <w:b/>
+                <w:bCs/>
+                <w:sz w:val="18"/>
+                <w:szCs w:val="18"/>
+              </w:rPr>
+              <w:t>Construct</w:t>
+            </w:r>
+            <w:proofErr w:type="spellEnd"/>
+            <w:r>
+              <w:rPr>
+                <w:rFonts w:ascii="Calibri" w:eastAsia="Calibri" w:hAnsi="Calibri" w:cs="Calibri"/>
+                <w:b/>
+                <w:bCs/>
+                <w:sz w:val="18"/>
+                <w:szCs w:val="18"/>
+              </w:rPr>
+              <w:t xml:space="preserve"> Name</w:t>
             </w:r>
           </w:p>
         </w:tc>
@@ -3426,13 +4176,43 @@
             <w:pPr>
               <w:keepNext/>
             </w:pPr>
-            <w:r>
-              <w:rPr>
-                <w:rFonts w:ascii="Calibri" w:eastAsia="Calibri" w:hAnsi="Calibri" w:cs="Calibri"/>
-                <w:sz w:val="19"/>
-                <w:szCs w:val="19"/>
-              </w:rPr>
-              <w:t>melatonin receptor 1Bb</w:t>
+            <w:proofErr w:type="spellStart"/>
+            <w:proofErr w:type="gramStart"/>
+            <w:r>
+              <w:rPr>
+                <w:rFonts w:ascii="Calibri" w:eastAsia="Calibri" w:hAnsi="Calibri" w:cs="Calibri"/>
+                <w:sz w:val="19"/>
+                <w:szCs w:val="19"/>
+              </w:rPr>
+              <w:t>melatonin</w:t>
+            </w:r>
+            <w:proofErr w:type="spellEnd"/>
+            <w:proofErr w:type="gramEnd"/>
+            <w:r>
+              <w:rPr>
+                <w:rFonts w:ascii="Calibri" w:eastAsia="Calibri" w:hAnsi="Calibri" w:cs="Calibri"/>
+                <w:sz w:val="19"/>
+                <w:szCs w:val="19"/>
+              </w:rPr>
+              <w:t xml:space="preserve"> </w:t>
+            </w:r>
+            <w:proofErr w:type="spellStart"/>
+            <w:r>
+              <w:rPr>
+                <w:rFonts w:ascii="Calibri" w:eastAsia="Calibri" w:hAnsi="Calibri" w:cs="Calibri"/>
+                <w:sz w:val="19"/>
+                <w:szCs w:val="19"/>
+              </w:rPr>
+              <w:t>receptor</w:t>
+            </w:r>
+            <w:proofErr w:type="spellEnd"/>
+            <w:r>
+              <w:rPr>
+                <w:rFonts w:ascii="Calibri" w:eastAsia="Calibri" w:hAnsi="Calibri" w:cs="Calibri"/>
+                <w:sz w:val="19"/>
+                <w:szCs w:val="19"/>
+              </w:rPr>
+              <w:t xml:space="preserve"> 1Bb</w:t>
             </w:r>
           </w:p>
         </w:tc>
@@ -3482,6 +4262,7 @@
             <w:pPr>
               <w:keepNext/>
             </w:pPr>
+            <w:proofErr w:type="gramStart"/>
             <w:r>
               <w:rPr>
                 <w:rFonts w:ascii="Calibri" w:eastAsia="Calibri" w:hAnsi="Calibri" w:cs="Calibri"/>
@@ -3490,7 +4271,18 @@
                 <w:sz w:val="19"/>
                 <w:szCs w:val="19"/>
               </w:rPr>
-              <w:t>mtnr1bb</w:t>
+              <w:t>mtnr</w:t>
+            </w:r>
+            <w:proofErr w:type="gramEnd"/>
+            <w:r>
+              <w:rPr>
+                <w:rFonts w:ascii="Calibri" w:eastAsia="Calibri" w:hAnsi="Calibri" w:cs="Calibri"/>
+                <w:i/>
+                <w:iCs/>
+                <w:sz w:val="19"/>
+                <w:szCs w:val="19"/>
+              </w:rPr>
+              <w:t>1bb</w:t>
             </w:r>
             <w:r>
               <w:rPr>
@@ -3522,16 +4314,40 @@
             <w:pPr>
               <w:keepNext/>
             </w:pPr>
-            <w:r>
-              <w:rPr>
-                <w:rFonts w:ascii="Calibri" w:eastAsia="Calibri" w:hAnsi="Calibri" w:cs="Calibri"/>
-                <w:b/>
-                <w:bCs/>
-                <w:sz w:val="18"/>
-                <w:szCs w:val="18"/>
-              </w:rPr>
-              <w:t>Allele/Line Designation</w:t>
-            </w:r>
+            <w:proofErr w:type="spellStart"/>
+            <w:r>
+              <w:rPr>
+                <w:rFonts w:ascii="Calibri" w:eastAsia="Calibri" w:hAnsi="Calibri" w:cs="Calibri"/>
+                <w:b/>
+                <w:bCs/>
+                <w:sz w:val="18"/>
+                <w:szCs w:val="18"/>
+              </w:rPr>
+              <w:t>Allele</w:t>
+            </w:r>
+            <w:proofErr w:type="spellEnd"/>
+            <w:r>
+              <w:rPr>
+                <w:rFonts w:ascii="Calibri" w:eastAsia="Calibri" w:hAnsi="Calibri" w:cs="Calibri"/>
+                <w:b/>
+                <w:bCs/>
+                <w:sz w:val="18"/>
+                <w:szCs w:val="18"/>
+              </w:rPr>
+              <w:t xml:space="preserve">/Line </w:t>
+            </w:r>
+            <w:proofErr w:type="spellStart"/>
+            <w:r>
+              <w:rPr>
+                <w:rFonts w:ascii="Calibri" w:eastAsia="Calibri" w:hAnsi="Calibri" w:cs="Calibri"/>
+                <w:b/>
+                <w:bCs/>
+                <w:sz w:val="18"/>
+                <w:szCs w:val="18"/>
+              </w:rPr>
+              <w:t>Designation</w:t>
+            </w:r>
+            <w:proofErr w:type="spellEnd"/>
           </w:p>
         </w:tc>
         <w:tc>
@@ -3548,13 +4364,23 @@
             <w:pPr>
               <w:keepNext/>
             </w:pPr>
-            <w:r>
-              <w:rPr>
-                <w:rFonts w:ascii="Calibri" w:eastAsia="Calibri" w:hAnsi="Calibri" w:cs="Calibri"/>
-                <w:sz w:val="19"/>
-                <w:szCs w:val="19"/>
-              </w:rPr>
-              <w:t>ly5</w:t>
+            <w:proofErr w:type="gramStart"/>
+            <w:r>
+              <w:rPr>
+                <w:rFonts w:ascii="Calibri" w:eastAsia="Calibri" w:hAnsi="Calibri" w:cs="Calibri"/>
+                <w:sz w:val="19"/>
+                <w:szCs w:val="19"/>
+              </w:rPr>
+              <w:t>ly</w:t>
+            </w:r>
+            <w:proofErr w:type="gramEnd"/>
+            <w:r>
+              <w:rPr>
+                <w:rFonts w:ascii="Calibri" w:eastAsia="Calibri" w:hAnsi="Calibri" w:cs="Calibri"/>
+                <w:sz w:val="19"/>
+                <w:szCs w:val="19"/>
+              </w:rPr>
+              <w:t>5</w:t>
             </w:r>
           </w:p>
         </w:tc>
@@ -3610,7 +4436,25 @@
                 <w:sz w:val="19"/>
                 <w:szCs w:val="19"/>
               </w:rPr>
-              <w:t>Cas9 protein injection</w:t>
+              <w:t xml:space="preserve">Cas9 </w:t>
+            </w:r>
+            <w:proofErr w:type="spellStart"/>
+            <w:r>
+              <w:rPr>
+                <w:rFonts w:ascii="Calibri" w:eastAsia="Calibri" w:hAnsi="Calibri" w:cs="Calibri"/>
+                <w:sz w:val="19"/>
+                <w:szCs w:val="19"/>
+              </w:rPr>
+              <w:t>protein</w:t>
+            </w:r>
+            <w:proofErr w:type="spellEnd"/>
+            <w:r>
+              <w:rPr>
+                <w:rFonts w:ascii="Calibri" w:eastAsia="Calibri" w:hAnsi="Calibri" w:cs="Calibri"/>
+                <w:sz w:val="19"/>
+                <w:szCs w:val="19"/>
+              </w:rPr>
+              <w:t xml:space="preserve"> injection</w:t>
             </w:r>
           </w:p>
         </w:tc>
@@ -3885,6 +4729,7 @@
               </w:rPr>
               <w:t xml:space="preserve">F </w:t>
             </w:r>
+            <w:proofErr w:type="gramStart"/>
             <w:r>
               <w:rPr>
                 <w:rFonts w:ascii="Courier New" w:eastAsia="Courier New" w:hAnsi="Courier New" w:cs="Courier New"/>
@@ -3901,7 +4746,17 @@
                 <w:szCs w:val="18"/>
                 <w:lang w:val="en-US"/>
               </w:rPr>
-              <w:t xml:space="preserve">  /  R </w:t>
+              <w:t xml:space="preserve">  /</w:t>
+            </w:r>
+            <w:proofErr w:type="gramEnd"/>
+            <w:r>
+              <w:rPr>
+                <w:rFonts w:ascii="Calibri" w:eastAsia="Calibri" w:hAnsi="Calibri" w:cs="Calibri"/>
+                <w:sz w:val="18"/>
+                <w:szCs w:val="18"/>
+                <w:lang w:val="en-US"/>
+              </w:rPr>
+              <w:t xml:space="preserve">  R </w:t>
             </w:r>
             <w:r>
               <w:rPr>
@@ -3967,8 +4822,20 @@
                 <w:sz w:val="18"/>
                 <w:szCs w:val="18"/>
               </w:rPr>
-              <w:t>CRISPR or TALEN Sequence</w:t>
-            </w:r>
+              <w:t xml:space="preserve">CRISPR or TALEN </w:t>
+            </w:r>
+            <w:proofErr w:type="spellStart"/>
+            <w:r>
+              <w:rPr>
+                <w:rFonts w:ascii="Calibri" w:eastAsia="Calibri" w:hAnsi="Calibri" w:cs="Calibri"/>
+                <w:b/>
+                <w:bCs/>
+                <w:sz w:val="18"/>
+                <w:szCs w:val="18"/>
+              </w:rPr>
+              <w:t>Sequence</w:t>
+            </w:r>
+            <w:proofErr w:type="spellEnd"/>
           </w:p>
         </w:tc>
         <w:tc>
@@ -3983,7 +4850,6 @@
           </w:tcPr>
           <w:p>
             <w:pPr>
-              <w:spacing w:after="30"/>
               <w:rPr>
                 <w:rFonts w:ascii="Courier New" w:eastAsia="Courier New" w:hAnsi="Courier New" w:cs="Courier New"/>
                 <w:sz w:val="17"/>
@@ -3996,7 +4862,15 @@
                 <w:sz w:val="17"/>
                 <w:szCs w:val="17"/>
               </w:rPr>
-              <w:t>TACAGAGCCGATCACACAC</w:t>
+              <w:t>TACAGAGCCGATCACACTC</w:t>
+            </w:r>
+            <w:r>
+              <w:rPr>
+                <w:rFonts w:ascii="Courier New" w:eastAsia="Courier New" w:hAnsi="Courier New" w:cs="Courier New"/>
+                <w:sz w:val="17"/>
+                <w:szCs w:val="17"/>
+              </w:rPr>
+              <w:t xml:space="preserve"> </w:t>
             </w:r>
           </w:p>
           <w:p>
@@ -4096,15 +4970,27 @@
             <w:pPr>
               <w:keepNext/>
             </w:pPr>
-            <w:r>
-              <w:rPr>
-                <w:rFonts w:ascii="Calibri" w:eastAsia="Calibri" w:hAnsi="Calibri" w:cs="Calibri"/>
-                <w:b/>
-                <w:bCs/>
-                <w:sz w:val="18"/>
-                <w:szCs w:val="18"/>
-              </w:rPr>
-              <w:t>Genetic Background</w:t>
+            <w:proofErr w:type="spellStart"/>
+            <w:r>
+              <w:rPr>
+                <w:rFonts w:ascii="Calibri" w:eastAsia="Calibri" w:hAnsi="Calibri" w:cs="Calibri"/>
+                <w:b/>
+                <w:bCs/>
+                <w:sz w:val="18"/>
+                <w:szCs w:val="18"/>
+              </w:rPr>
+              <w:t>Genetic</w:t>
+            </w:r>
+            <w:proofErr w:type="spellEnd"/>
+            <w:r>
+              <w:rPr>
+                <w:rFonts w:ascii="Calibri" w:eastAsia="Calibri" w:hAnsi="Calibri" w:cs="Calibri"/>
+                <w:b/>
+                <w:bCs/>
+                <w:sz w:val="18"/>
+                <w:szCs w:val="18"/>
+              </w:rPr>
+              <w:t xml:space="preserve"> Background</w:t>
             </w:r>
           </w:p>
         </w:tc>
@@ -4160,7 +5046,29 @@
                 <w:sz w:val="18"/>
                 <w:szCs w:val="18"/>
               </w:rPr>
-              <w:t>Gene or Construct Name</w:t>
+              <w:t xml:space="preserve">Gene or </w:t>
+            </w:r>
+            <w:proofErr w:type="spellStart"/>
+            <w:r>
+              <w:rPr>
+                <w:rFonts w:ascii="Calibri" w:eastAsia="Calibri" w:hAnsi="Calibri" w:cs="Calibri"/>
+                <w:b/>
+                <w:bCs/>
+                <w:sz w:val="18"/>
+                <w:szCs w:val="18"/>
+              </w:rPr>
+              <w:t>Construct</w:t>
+            </w:r>
+            <w:proofErr w:type="spellEnd"/>
+            <w:r>
+              <w:rPr>
+                <w:rFonts w:ascii="Calibri" w:eastAsia="Calibri" w:hAnsi="Calibri" w:cs="Calibri"/>
+                <w:b/>
+                <w:bCs/>
+                <w:sz w:val="18"/>
+                <w:szCs w:val="18"/>
+              </w:rPr>
+              <w:t xml:space="preserve"> Name</w:t>
             </w:r>
           </w:p>
         </w:tc>
@@ -4178,13 +5086,43 @@
             <w:pPr>
               <w:keepNext/>
             </w:pPr>
-            <w:r>
-              <w:rPr>
-                <w:rFonts w:ascii="Calibri" w:eastAsia="Calibri" w:hAnsi="Calibri" w:cs="Calibri"/>
-                <w:sz w:val="19"/>
-                <w:szCs w:val="19"/>
-              </w:rPr>
-              <w:t>melatonin receptor 1C</w:t>
+            <w:proofErr w:type="spellStart"/>
+            <w:proofErr w:type="gramStart"/>
+            <w:r>
+              <w:rPr>
+                <w:rFonts w:ascii="Calibri" w:eastAsia="Calibri" w:hAnsi="Calibri" w:cs="Calibri"/>
+                <w:sz w:val="19"/>
+                <w:szCs w:val="19"/>
+              </w:rPr>
+              <w:t>melatonin</w:t>
+            </w:r>
+            <w:proofErr w:type="spellEnd"/>
+            <w:proofErr w:type="gramEnd"/>
+            <w:r>
+              <w:rPr>
+                <w:rFonts w:ascii="Calibri" w:eastAsia="Calibri" w:hAnsi="Calibri" w:cs="Calibri"/>
+                <w:sz w:val="19"/>
+                <w:szCs w:val="19"/>
+              </w:rPr>
+              <w:t xml:space="preserve"> </w:t>
+            </w:r>
+            <w:proofErr w:type="spellStart"/>
+            <w:r>
+              <w:rPr>
+                <w:rFonts w:ascii="Calibri" w:eastAsia="Calibri" w:hAnsi="Calibri" w:cs="Calibri"/>
+                <w:sz w:val="19"/>
+                <w:szCs w:val="19"/>
+              </w:rPr>
+              <w:t>receptor</w:t>
+            </w:r>
+            <w:proofErr w:type="spellEnd"/>
+            <w:r>
+              <w:rPr>
+                <w:rFonts w:ascii="Calibri" w:eastAsia="Calibri" w:hAnsi="Calibri" w:cs="Calibri"/>
+                <w:sz w:val="19"/>
+                <w:szCs w:val="19"/>
+              </w:rPr>
+              <w:t xml:space="preserve"> 1C</w:t>
             </w:r>
           </w:p>
         </w:tc>
@@ -4234,6 +5172,7 @@
             <w:pPr>
               <w:keepNext/>
             </w:pPr>
+            <w:proofErr w:type="gramStart"/>
             <w:r>
               <w:rPr>
                 <w:rFonts w:ascii="Calibri" w:eastAsia="Calibri" w:hAnsi="Calibri" w:cs="Calibri"/>
@@ -4242,7 +5181,18 @@
                 <w:sz w:val="19"/>
                 <w:szCs w:val="19"/>
               </w:rPr>
-              <w:t>mtnr1c</w:t>
+              <w:t>mtnr</w:t>
+            </w:r>
+            <w:proofErr w:type="gramEnd"/>
+            <w:r>
+              <w:rPr>
+                <w:rFonts w:ascii="Calibri" w:eastAsia="Calibri" w:hAnsi="Calibri" w:cs="Calibri"/>
+                <w:i/>
+                <w:iCs/>
+                <w:sz w:val="19"/>
+                <w:szCs w:val="19"/>
+              </w:rPr>
+              <w:t>1c</w:t>
             </w:r>
             <w:r>
               <w:rPr>
@@ -4274,16 +5224,40 @@
             <w:pPr>
               <w:keepNext/>
             </w:pPr>
-            <w:r>
-              <w:rPr>
-                <w:rFonts w:ascii="Calibri" w:eastAsia="Calibri" w:hAnsi="Calibri" w:cs="Calibri"/>
-                <w:b/>
-                <w:bCs/>
-                <w:sz w:val="18"/>
-                <w:szCs w:val="18"/>
-              </w:rPr>
-              <w:t>Allele/Line Designation</w:t>
-            </w:r>
+            <w:proofErr w:type="spellStart"/>
+            <w:r>
+              <w:rPr>
+                <w:rFonts w:ascii="Calibri" w:eastAsia="Calibri" w:hAnsi="Calibri" w:cs="Calibri"/>
+                <w:b/>
+                <w:bCs/>
+                <w:sz w:val="18"/>
+                <w:szCs w:val="18"/>
+              </w:rPr>
+              <w:t>Allele</w:t>
+            </w:r>
+            <w:proofErr w:type="spellEnd"/>
+            <w:r>
+              <w:rPr>
+                <w:rFonts w:ascii="Calibri" w:eastAsia="Calibri" w:hAnsi="Calibri" w:cs="Calibri"/>
+                <w:b/>
+                <w:bCs/>
+                <w:sz w:val="18"/>
+                <w:szCs w:val="18"/>
+              </w:rPr>
+              <w:t xml:space="preserve">/Line </w:t>
+            </w:r>
+            <w:proofErr w:type="spellStart"/>
+            <w:r>
+              <w:rPr>
+                <w:rFonts w:ascii="Calibri" w:eastAsia="Calibri" w:hAnsi="Calibri" w:cs="Calibri"/>
+                <w:b/>
+                <w:bCs/>
+                <w:sz w:val="18"/>
+                <w:szCs w:val="18"/>
+              </w:rPr>
+              <w:t>Designation</w:t>
+            </w:r>
+            <w:proofErr w:type="spellEnd"/>
           </w:p>
         </w:tc>
         <w:tc>
@@ -4300,13 +5274,23 @@
             <w:pPr>
               <w:keepNext/>
             </w:pPr>
-            <w:r>
-              <w:rPr>
-                <w:rFonts w:ascii="Calibri" w:eastAsia="Calibri" w:hAnsi="Calibri" w:cs="Calibri"/>
-                <w:sz w:val="19"/>
-                <w:szCs w:val="19"/>
-              </w:rPr>
-              <w:t>ly6</w:t>
+            <w:proofErr w:type="gramStart"/>
+            <w:r>
+              <w:rPr>
+                <w:rFonts w:ascii="Calibri" w:eastAsia="Calibri" w:hAnsi="Calibri" w:cs="Calibri"/>
+                <w:sz w:val="19"/>
+                <w:szCs w:val="19"/>
+              </w:rPr>
+              <w:t>ly</w:t>
+            </w:r>
+            <w:proofErr w:type="gramEnd"/>
+            <w:r>
+              <w:rPr>
+                <w:rFonts w:ascii="Calibri" w:eastAsia="Calibri" w:hAnsi="Calibri" w:cs="Calibri"/>
+                <w:sz w:val="19"/>
+                <w:szCs w:val="19"/>
+              </w:rPr>
+              <w:t>6</w:t>
             </w:r>
           </w:p>
         </w:tc>
@@ -4362,7 +5346,25 @@
                 <w:sz w:val="19"/>
                 <w:szCs w:val="19"/>
               </w:rPr>
-              <w:t>Cas9 protein injection</w:t>
+              <w:t xml:space="preserve">Cas9 </w:t>
+            </w:r>
+            <w:proofErr w:type="spellStart"/>
+            <w:r>
+              <w:rPr>
+                <w:rFonts w:ascii="Calibri" w:eastAsia="Calibri" w:hAnsi="Calibri" w:cs="Calibri"/>
+                <w:sz w:val="19"/>
+                <w:szCs w:val="19"/>
+              </w:rPr>
+              <w:t>protein</w:t>
+            </w:r>
+            <w:proofErr w:type="spellEnd"/>
+            <w:r>
+              <w:rPr>
+                <w:rFonts w:ascii="Calibri" w:eastAsia="Calibri" w:hAnsi="Calibri" w:cs="Calibri"/>
+                <w:sz w:val="19"/>
+                <w:szCs w:val="19"/>
+              </w:rPr>
+              <w:t xml:space="preserve"> injection</w:t>
             </w:r>
           </w:p>
         </w:tc>
@@ -4599,6 +5601,7 @@
               </w:rPr>
               <w:t xml:space="preserve">F </w:t>
             </w:r>
+            <w:proofErr w:type="gramStart"/>
             <w:r>
               <w:rPr>
                 <w:rFonts w:ascii="Courier New" w:eastAsia="Courier New" w:hAnsi="Courier New" w:cs="Courier New"/>
@@ -4615,7 +5618,17 @@
                 <w:szCs w:val="18"/>
                 <w:lang w:val="en-US"/>
               </w:rPr>
-              <w:t xml:space="preserve">  /  R </w:t>
+              <w:t xml:space="preserve">  /</w:t>
+            </w:r>
+            <w:proofErr w:type="gramEnd"/>
+            <w:r>
+              <w:rPr>
+                <w:rFonts w:ascii="Calibri" w:eastAsia="Calibri" w:hAnsi="Calibri" w:cs="Calibri"/>
+                <w:sz w:val="18"/>
+                <w:szCs w:val="18"/>
+                <w:lang w:val="en-US"/>
+              </w:rPr>
+              <w:t xml:space="preserve">  R </w:t>
             </w:r>
             <w:r>
               <w:rPr>
@@ -4681,8 +5694,20 @@
                 <w:sz w:val="18"/>
                 <w:szCs w:val="18"/>
               </w:rPr>
-              <w:t>CRISPR or TALEN Sequence</w:t>
-            </w:r>
+              <w:t xml:space="preserve">CRISPR or TALEN </w:t>
+            </w:r>
+            <w:proofErr w:type="spellStart"/>
+            <w:r>
+              <w:rPr>
+                <w:rFonts w:ascii="Calibri" w:eastAsia="Calibri" w:hAnsi="Calibri" w:cs="Calibri"/>
+                <w:b/>
+                <w:bCs/>
+                <w:sz w:val="18"/>
+                <w:szCs w:val="18"/>
+              </w:rPr>
+              <w:t>Sequence</w:t>
+            </w:r>
+            <w:proofErr w:type="spellEnd"/>
           </w:p>
         </w:tc>
         <w:tc>
@@ -4739,8 +5764,20 @@
           <w:szCs w:val="24"/>
         </w:rPr>
         <w:lastRenderedPageBreak/>
-        <w:t>Publication Status</w:t>
+        <w:t xml:space="preserve">Publication </w:t>
       </w:r>
+      <w:proofErr w:type="spellStart"/>
+      <w:r>
+        <w:rPr>
+          <w:rFonts w:ascii="Calibri" w:eastAsia="Calibri" w:hAnsi="Calibri" w:cs="Calibri"/>
+          <w:b/>
+          <w:bCs/>
+          <w:sz w:val="24"/>
+          <w:szCs w:val="24"/>
+        </w:rPr>
+        <w:t>Status</w:t>
+      </w:r>
+      <w:proofErr w:type="spellEnd"/>
     </w:p>
     <w:tbl>
       <w:tblPr>
@@ -4779,6 +5816,7 @@
             </w:tcMar>
           </w:tcPr>
           <w:p>
+            <w:proofErr w:type="spellStart"/>
             <w:r>
               <w:rPr>
                 <w:rFonts w:ascii="Calibri" w:eastAsia="Calibri" w:hAnsi="Calibri" w:cs="Calibri"/>
@@ -4789,6 +5827,7 @@
               </w:rPr>
               <w:t>Selection</w:t>
             </w:r>
+            <w:proofErr w:type="spellEnd"/>
           </w:p>
         </w:tc>
         <w:tc>
@@ -4808,8 +5847,18 @@
                 <w:sz w:val="19"/>
                 <w:szCs w:val="19"/>
               </w:rPr>
-              <w:t>In Preparation</w:t>
-            </w:r>
+              <w:t xml:space="preserve">In </w:t>
+            </w:r>
+            <w:proofErr w:type="spellStart"/>
+            <w:r>
+              <w:rPr>
+                <w:rFonts w:ascii="Calibri" w:eastAsia="Calibri" w:hAnsi="Calibri" w:cs="Calibri"/>
+                <w:sz w:val="19"/>
+                <w:szCs w:val="19"/>
+              </w:rPr>
+              <w:t>Preparation</w:t>
+            </w:r>
+            <w:proofErr w:type="spellEnd"/>
           </w:p>
         </w:tc>
       </w:tr>
@@ -4864,7 +5913,27 @@
                 <w:szCs w:val="19"/>
                 <w:lang w:val="en-US"/>
               </w:rPr>
-              <w:t>Manuscript to be posted to bioRxiv shortly; the citation will follow.</w:t>
+              <w:t xml:space="preserve">Manuscript to be posted to </w:t>
+            </w:r>
+            <w:proofErr w:type="spellStart"/>
+            <w:r>
+              <w:rPr>
+                <w:rFonts w:ascii="Calibri" w:eastAsia="Calibri" w:hAnsi="Calibri" w:cs="Calibri"/>
+                <w:sz w:val="19"/>
+                <w:szCs w:val="19"/>
+                <w:lang w:val="en-US"/>
+              </w:rPr>
+              <w:t>bioRxiv</w:t>
+            </w:r>
+            <w:proofErr w:type="spellEnd"/>
+            <w:r>
+              <w:rPr>
+                <w:rFonts w:ascii="Calibri" w:eastAsia="Calibri" w:hAnsi="Calibri" w:cs="Calibri"/>
+                <w:sz w:val="19"/>
+                <w:szCs w:val="19"/>
+                <w:lang w:val="en-US"/>
+              </w:rPr>
+              <w:t xml:space="preserve"> shortly; the citation will follow.</w:t>
             </w:r>
           </w:p>
         </w:tc>

</xml_diff>